<commit_message>
updated to R 4.6.1
</commit_message>
<xml_diff>
--- a/docs/index.docx
+++ b/docs/index.docx
@@ -1110,6 +1110,15 @@
         </w:r>
       </w:hyperlink>
       <w:r>
+        <w:t xml:space="preserve">;</w:t>
+      </w:r>
+      <w:r>
+        <w:t xml:space="preserve"> </w:t>
+      </w:r>
+      <w:r>
+        <w:t xml:space="preserve">(Table S1)</w:t>
+      </w:r>
+      <w:r>
         <w:t xml:space="preserve">). Under light conditions, the control showed the largest overall increase in refuge use (40% to 82%), driven primarily by a sharp rise in the</w:t>
       </w:r>
       <w:r>
@@ -1210,11 +1219,7 @@
         <w:t xml:space="preserve"> </w:t>
       </w:r>
       <w:r>
-        <w:rPr>
-          <w:b/>
-          <w:bCs/>
-        </w:rPr>
-        <w:t xml:space="preserve">?@tbl-feeding-summary</w:t>
+        <w:t xml:space="preserve">(Table S2)</w:t>
       </w:r>
       <w:r>
         <w:t xml:space="preserve">). Treatment was not included in the main model following model selection. Stratified analyses revealed no significant treatment effects across starvation periods. Although residuals at day 0 violated normality (Shapiro-Wilk</w:t>

</xml_diff>

<commit_message>
Reenderd with small updates
</commit_message>
<xml_diff>
--- a/docs/index.docx
+++ b/docs/index.docx
@@ -846,7 +846,7 @@
             <w:r>
               <w:drawing>
                 <wp:inline>
-                  <wp:extent cx="5727700" cy="4480989"/>
+                  <wp:extent cx="4582160" cy="3584791"/>
                   <wp:effectExtent b="0" l="0" r="0" t="0"/>
                   <wp:docPr descr="" title="" id="23" name="Picture"/>
                   <a:graphic>
@@ -867,7 +867,7 @@
                         <pic:spPr bwMode="auto">
                           <a:xfrm>
                             <a:off x="0" y="0"/>
-                            <a:ext cx="5727700" cy="4480989"/>
+                            <a:ext cx="4582160" cy="3584791"/>
                           </a:xfrm>
                           <a:prstGeom prst="rect">
                             <a:avLst/>
@@ -1195,7 +1195,7 @@
             <w:r>
               <w:drawing>
                 <wp:inline>
-                  <wp:extent cx="5727700" cy="4582160"/>
+                  <wp:extent cx="3723005" cy="2978404"/>
                   <wp:effectExtent b="0" l="0" r="0" t="0"/>
                   <wp:docPr descr="" title="" id="31" name="Picture"/>
                   <a:graphic>
@@ -1216,7 +1216,7 @@
                         <pic:spPr bwMode="auto">
                           <a:xfrm>
                             <a:off x="0" y="0"/>
-                            <a:ext cx="5727700" cy="4582160"/>
+                            <a:ext cx="3723005" cy="2978404"/>
                           </a:xfrm>
                           <a:prstGeom prst="rect">
                             <a:avLst/>
@@ -2788,7 +2788,7 @@
             <w:r>
               <w:drawing>
                 <wp:inline>
-                  <wp:extent cx="5727700" cy="3579812"/>
+                  <wp:extent cx="4582160" cy="2863850"/>
                   <wp:effectExtent b="0" l="0" r="0" t="0"/>
                   <wp:docPr descr="" title="" id="37" name="Picture"/>
                   <a:graphic>
@@ -2809,7 +2809,7 @@
                         <pic:spPr bwMode="auto">
                           <a:xfrm>
                             <a:off x="0" y="0"/>
-                            <a:ext cx="5727700" cy="3579812"/>
+                            <a:ext cx="4582160" cy="2863850"/>
                           </a:xfrm>
                           <a:prstGeom prst="rect">
                             <a:avLst/>
@@ -2996,7 +2996,7 @@
             <w:r>
               <w:drawing>
                 <wp:inline>
-                  <wp:extent cx="4572000" cy="3657600"/>
+                  <wp:extent cx="3723005" cy="2978404"/>
                   <wp:effectExtent b="0" l="0" r="0" t="0"/>
                   <wp:docPr descr="" title="" id="42" name="Picture"/>
                   <a:graphic>
@@ -3017,7 +3017,7 @@
                         <pic:spPr bwMode="auto">
                           <a:xfrm>
                             <a:off x="0" y="0"/>
-                            <a:ext cx="4572000" cy="3657600"/>
+                            <a:ext cx="3723005" cy="2978404"/>
                           </a:xfrm>
                           <a:prstGeom prst="rect">
                             <a:avLst/>
@@ -3205,7 +3205,7 @@
         <w:pStyle w:val="BodyText"/>
       </w:pPr>
       <w:r>
-        <w:t xml:space="preserve">Before fish were added to the tanks, refuge use by koūra was similar across treatments but highly variable at the individual level, reflecting substantial behavioural variation. The control treatment showed increasing refuge use over time, particularly under light conditions, which is unsurprising given that kōura are nocturnally adapted and need to remain hidden during daylight to avoid visual predators such as cormorants</w:t>
+        <w:t xml:space="preserve">Before fish were added to the tanks, refuge use by kōura was similar across treatments but highly variable at the individual level, reflecting substantial behavioural variation. The control treatment showed increasing refuge use over time, particularly under light conditions, which is unsurprising given that kōura are nocturnally adapted and need to remain hidden during daylight to avoid visual predators such as cormorants</w:t>
       </w:r>
       <w:r>
         <w:t xml:space="preserve"> </w:t>

</xml_diff>

<commit_message>
Updated with small comments not with reviewer comments yet just 5 sentences updated
</commit_message>
<xml_diff>
--- a/docs/index.docx
+++ b/docs/index.docx
@@ -224,7 +224,7 @@
         <w:t xml:space="preserve"> </w:t>
       </w:r>
       <w:r>
-        <w:t xml:space="preserve">Fear of the new: a predatory invader provokes stronger non-consumptive effects on a keystone native prey than a native predator</w:t>
+        <w:t xml:space="preserve">Fear of the new: a native crayfish shows stronger refuge-seeking behaviour toward an invasive catfish than a native eel</w:t>
       </w:r>
     </w:p>
     <w:p>
@@ -297,7 +297,7 @@
         <w:t xml:space="preserve"> </w:t>
       </w:r>
       <w:r>
-        <w:t xml:space="preserve">— Under review</w:t>
+        <w:t xml:space="preserve">— Revising for resubmission</w:t>
       </w:r>
     </w:p>
     <w:p>
@@ -349,7 +349,7 @@
         <w:t xml:space="preserve">Ameiurus nebulosus</w:t>
       </w:r>
       <w:r>
-        <w:t xml:space="preserve">). Under laboratory conditions, we tested whether visual and chemical cues from these two predators induced different refuge-seeking and feeding behaviour responses by kōura. Predator presence produced in the dark a NCE on refuge use, with kōura exposed to catfish showing significantly greater refuge-seeking behaviour than those exposed to eels. This result is consistent with the generalisation theory triggered by unfamiliar predator cues rather than classic prey naivety. Our study indicates catfish incursions may provoke a greater NCE on kōura behaviours than resident eels. As catfish range expansion continues, these NCEs may represent an ecologically significant and underappreciated threat to kōura populations, compounding the direct predation pressure already documented for this invader.</w:t>
+        <w:t xml:space="preserve">). Under laboratory conditions, we tested whether visual and chemical cues from these two predators induced different refuge-seeking and feeding behaviour responses by kōura. In dark conditions, kōura exposed to catfish showed significantly greater refuge-seeking behaviour than those exposed to eels. This result is consistent with the generalisation theory triggered by unfamiliar predator cues rather than classic prey naivety. Our study indicates catfish incursions may provoke a greater NCE on kōura behaviours than resident eels. As catfish range expansion continues, these NCEs may represent an ecologically significant and underappreciated threat to kōura populations, compounding the direct predation pressure already documented for this invader.</w:t>
       </w:r>
     </w:p>
     <w:bookmarkEnd w:id="19"/>
@@ -846,7 +846,7 @@
             <w:r>
               <w:drawing>
                 <wp:inline>
-                  <wp:extent cx="4582160" cy="3584791"/>
+                  <wp:extent cx="5727700" cy="4480989"/>
                   <wp:effectExtent b="0" l="0" r="0" t="0"/>
                   <wp:docPr descr="" title="" id="23" name="Picture"/>
                   <a:graphic>
@@ -867,7 +867,7 @@
                         <pic:spPr bwMode="auto">
                           <a:xfrm>
                             <a:off x="0" y="0"/>
-                            <a:ext cx="4582160" cy="3584791"/>
+                            <a:ext cx="5727700" cy="4480989"/>
                           </a:xfrm>
                           <a:prstGeom prst="rect">
                             <a:avLst/>
@@ -896,7 +896,7 @@
               <w:pStyle w:val="ImageCaption"/>
             </w:pPr>
             <w:r>
-              <w:t xml:space="preserve">Figure 1: (a) Aquarium layout for kōura refuge seeking behaviour experiment. Each experimental round consisted of eight aquaria run simultaneously. Each tank contained a single kōura (K) and refuge (half terracotta plant pot) on one side of a mesh divider. On the other side was either a single catfish (C), eel (E) or a control with no fish. The mesh divider allowed visual and chemical cues while preventing direct physical contact between tank occupants. (b) Experiments were repeated in light and dark (red light), with photographs showing a catfish in the light regime (left) and and an eel in the dark regime (red light) (right) separated from kōura by mesh dividers.</w:t>
+              <w:t xml:space="preserve">Figure 1: (a) Aquarium layout for kōura refuge seeking behaviour experiment. Each experimental round consisted of eight aquaria run simultaneously. Each tank contained a single kōura (K) and refuge (half terracotta plant pot) on one side of a mesh divider. On the other side was either a single catfish (C), eel (E) or a control with no fish. The mesh divider allowed visual and chemical cues while preventing direct physical contact between tank occupants. (b) Experiments were repeated in light and dark (red light), with photographs showing a catfish in the light regime (left) and an eel in the dark regime (red light) (right) separated from kōura by mesh dividers.</w:t>
             </w:r>
           </w:p>
           <w:bookmarkEnd w:id="25"/>
@@ -1040,7 +1040,7 @@
         </w:r>
       </w:hyperlink>
       <w:r>
-        <w:t xml:space="preserve">). Stratified analyses revealed that treatment effects on refuge use differed between light and dark conditions. Under dark condition, kōura exposed to catfish used refuge significantly more than those exposed to eels (</w:t>
+        <w:t xml:space="preserve">). Stratified analyses revealed that treatment effects on refuge use differed between light and dark conditions. Under dark conditions, kōura exposed to catfish used refuge significantly more than those exposed to eels (</w:t>
       </w:r>
       <w:r>
         <w:rPr>
@@ -3090,16 +3090,7 @@
         <w:t xml:space="preserve">(Laundré et al. 2001)</w:t>
       </w:r>
       <w:r>
-        <w:t xml:space="preserve">. Our study adds to a growing body of literature (i.e.,</w:t>
-      </w:r>
-      <w:r>
-        <w:t xml:space="preserve"> </w:t>
-      </w:r>
-      <w:r>
-        <w:t xml:space="preserve">(Sniegula et al. 2025)</w:t>
-      </w:r>
-      <w:r>
-        <w:t xml:space="preserve">) showing invasive predators can generate stronger NCEs on native prey than native predators, with potentially far-reaching consequences on invaded ecosystems. The results in our experiments suggest the introduction of a novel predator may change the prey’s fear landscape in ways that a native predator does not. Kōura are a keystone species that act as ecosystem engineers in Aotearoa freshwaters, meaning that predator-induced changed in kōura behaviour may indirectly affect ecosystem-level properties (e.g., resources or other species) through non-consumptive pathways</w:t>
+        <w:t xml:space="preserve">. Our study shows that kōura respond asymmetrically to native versus invasive predator cues, with greater refuge use in catfish treatments than eel treatments under dark conditions, with potentially far-reaching consequences on invaded ecosystems. The results in our experiments suggest the introduction of a novel predator may change the prey’s fear landscape in ways that a native predator does not. Kōura are a keystone species that act as ecosystem engineers in Aotearoa freshwaters, meaning that predator-induced changes in kōura behaviour may indirectly affect ecosystem-level properties (e.g., resources or other species) through non-consumptive pathways</w:t>
       </w:r>
       <w:r>
         <w:t xml:space="preserve"> </w:t>
@@ -3214,7 +3205,7 @@
         <w:t xml:space="preserve">(Devcich 1979)</w:t>
       </w:r>
       <w:r>
-        <w:t xml:space="preserve">. Importantly, treatment effects on refuge use depended on light condition. Under dark conditions, when kōura are naturally more active, catfish exposure resulted in significantly greater refuge use than eel exposure. Control refuge use was intermediate between the two predator treatments, though the reasons for this pattern are unclear from the current data. The contrasting responses of kōura to catfish and eels indicates biologically meaningful differences in NCE between exposure to a novel and native predator.</w:t>
+        <w:t xml:space="preserve">. Importantly, treatment effects on refuge use depended on light condition. Under dark conditions, when kōura are naturally more active, catfish exposure resulted in significantly greater refuge use than eel exposure. Control refuge use was intermediate between the two predator treatments, though the reasons for this pattern are unclear from the current data. The contrasting responses of kōura to catfish and eels indicates biologically meaningful differences in behavioural responses to a novel and native predator.</w:t>
       </w:r>
     </w:p>
     <w:p>
@@ -3369,7 +3360,7 @@
         <w:t xml:space="preserve">(Hazlett 2003)</w:t>
       </w:r>
       <w:r>
-        <w:t xml:space="preserve">. In the current study, the longest starvation period was four days and at this point there was a clear discrepancy between the control feeding rate and the much lower feeding rates in the two fish treatments. Allowing for ethics and welfare concerns, if we had extended the starvation period, this may have elicited a stronger and prolonged response. Additionally, the stress of confinement in an artificial setting may itself have altered normal kōura feeding responses, as elevated baseline stress hormones are known to modify foraging behaviour independently of predator cue exposure</w:t>
+        <w:t xml:space="preserve">. At day 4, control feeding rates were numerically higher than the two fish treatments, though this difference was not statistically significant and the direction of the trend reversed at day 3. Allowing for ethics and welfare concerns, if we had extended the starvation period, this may have elicited a stronger and prolonged response. Additionally, the stress of confinement in an artificial setting may itself have altered normal kōura feeding responses, as elevated baseline stress hormones are known to modify foraging behaviour independently of predator cue exposure</w:t>
       </w:r>
       <w:r>
         <w:t xml:space="preserve"> </w:t>
@@ -3414,7 +3405,7 @@
         <w:t xml:space="preserve">(Sih et al. 2011)</w:t>
       </w:r>
       <w:r>
-        <w:t xml:space="preserve">. The present study provides experimental evidence that invasive brown bullhead catfish have the potential to exert stronger NCEs on kōura, an endemic freshwater crayfish when compared to their native predator, the longfin eel. The heightened refuge-seeking response to catfish likely reflects a generalised antipredator response triggered by unfamiliar chemical and visual cues, consistent with a fear generalisation framework. In contrast, the reduced response to eels suggests that familiarity with native predators enables kōura to make more proportionate risk assessments, although their behaviour may have also been an antipredator strategy. Future studies should particularly include kōura from eel-inhabited waterways, which would determine whether populations with a recent coevolutionary history with native eels display similar proportionate responses, thereby confirming whether the patterns observed here reflect broader adaptive differences across kōura populations with distinct predatory histories. Additionally, comparative studies of kōura sourced from catfish-invaded versus catfish-free catchments would be worthwhile to assess whether repeated exposure over multiple generations has resulted in rapid evolution or behavioural plasticity in antipredator responses, and whether catfish-experienced kōura show more calibrated responses to catfish presence than naïve kōura. Such evolutionary dynamics could have important implications for predicting kōura persistence in catfish-invaded systems</w:t>
+        <w:t xml:space="preserve">. The present study provides experimental evidence of asymmetric behavioural responses in kōura to catfish versus native eels, with greater refuge use under catfish exposure in dark conditions. The heightened refuge-seeking response to catfish likely reflects a generalised antipredator response triggered by unfamiliar chemical and visual cues, consistent with a fear generalisation framework. In contrast, the reduced response to eels suggests that familiarity with native predators enables kōura to make more proportionate risk assessments, although their behaviour may have also been an antipredator strategy. Future studies should particularly include kōura from eel-inhabited waterways, which would determine whether populations with a recent coevolutionary history with native eels display similar proportionate responses, thereby confirming whether the patterns observed here reflect broader adaptive differences across kōura populations with distinct predatory histories. Additionally, comparative studies of kōura sourced from catfish-invaded versus catfish-free catchments would be worthwhile to assess whether repeated exposure over multiple generations has resulted in rapid evolution or behavioural plasticity in antipredator responses, and whether catfish-experienced kōura show more calibrated responses to catfish presence than naïve kōura. Such evolutionary dynamics could have important implications for predicting kōura persistence in catfish-invaded systems</w:t>
       </w:r>
       <w:r>
         <w:t xml:space="preserve"> </w:t>
@@ -3423,7 +3414,7 @@
         <w:t xml:space="preserve">(Sih et al. 2010)</w:t>
       </w:r>
       <w:r>
-        <w:t xml:space="preserve">. From a management perspective, translocation of kōura from catfish-experienced source populations into catchments facing imminent catfish invasion may represent a more feasible strategy for seeding populations with individuals capable of more adaptive responses. Although we found no significant NCE of fish exudates on feeding behaviour, our study suggests further investigations of non-visual predator cues on kōura foraging behaviour is warranted. Because kōura are a keystone species that ecosystem engineer, even a small increase in refuge use driven by catfish presence could have cascading effects on sediment dynamics, decomposition, and nutrient cycling in invaded lakes. As brown bullhead catfish continue to spread across Aotearoa’s rivers and lakes, management strategies aimed at protecting kōura should account for the behavioural cost of catfish NCEs alongside direct predation pressure as an underappreciated and ecologically significant dimension to this invasion.</w:t>
+        <w:t xml:space="preserve">. From a management perspective, translocation of kōura from catfish-experienced source populations into catchments facing imminent catfish invasion may represent a more feasible strategy for seeding populations with individuals capable of more adaptive responses. Although we found no significant NCE of fish exudates on feeding behaviour, our study suggests further investigations of non-visual predator cues on kōura foraging behaviour is warranted. Because kōura are a keystone species that act as ecosystem engineer, even a small increase in refuge use driven by catfish presence could have cascading effects on sediment dynamics, decomposition, and nutrient cycling in invaded lakes. As brown bullhead catfish continue to spread across Aotearoa’s rivers and lakes, management strategies aimed at protecting kōura should account for the behavioural cost of catfish NCEs alongside direct predation pressure as an underappreciated and ecologically significant dimension to this invasion.</w:t>
       </w:r>
     </w:p>
     <w:bookmarkEnd w:id="49"/>
@@ -3531,7 +3522,7 @@
         <w:pStyle w:val="FirstParagraph"/>
       </w:pPr>
       <w:r>
-        <w:t xml:space="preserve">The code and derived data supporting the findings of this study are openly available on GitHub (https://github.com/OlivierRaven/Koura_Fear)and a rendered version of the analysis is hosted at https://olivierraven.github.io/Koura_Fear/. The primary raw dataset is archived on Zenodo (https://doi.org/10.5281/zenodo.19716761). Peer review documents, including the cover letter and reviewer responses, are available in the manuscript repository in the interest of open and transparent science.</w:t>
+        <w:t xml:space="preserve">The code and derived data supporting the findings of this study are openly available on GitHub (https://github.com/OlivierRaven/Koura_Fear) and a rendered version of the analysis is hosted at https://olivierraven.github.io/Koura_Fear/. The primary raw dataset is archived on Zenodo (https://doi.org/10.5281/zenodo.19716761). Peer review documents, including the cover letter and reviewer responses, are available in the manuscript repository in the interest of open and transparent science.</w:t>
       </w:r>
     </w:p>
     <w:bookmarkEnd w:id="55"/>
@@ -3558,7 +3549,7 @@
       </w:r>
     </w:p>
     <w:bookmarkEnd w:id="57"/>
-    <w:bookmarkStart w:id="181" w:name="refs"/>
+    <w:bookmarkStart w:id="179" w:name="refs"/>
     <w:bookmarkStart w:id="59" w:name="ref-Abrams2000"/>
     <w:p>
       <w:pPr>
@@ -4734,7 +4725,7 @@
       </w:hyperlink>
     </w:p>
     <w:bookmarkEnd w:id="114"/>
-    <w:bookmarkStart w:id="116" w:name="ref-Kindlinger2017"/>
+    <w:bookmarkStart w:id="116" w:name="ref-Kindinger2017"/>
     <w:p>
       <w:pPr>
         <w:pStyle w:val="Bibliography"/>
@@ -4794,7 +4785,7 @@
         <w:pStyle w:val="Bibliography"/>
       </w:pPr>
       <w:r>
-        <w:t xml:space="preserve">Kusabs IA, Quinn JM (2009) Use of a traditional</w:t>
+        <w:t xml:space="preserve">Kusabs IAK, Quinn JM (2009) Use of a traditional</w:t>
       </w:r>
       <w:r>
         <w:t xml:space="preserve"> </w:t>
@@ -4987,7 +4978,7 @@
         <w:pStyle w:val="Bibliography"/>
       </w:pPr>
       <w:r>
-        <w:t xml:space="preserve">MacNeil C, Lee F, Kusabs I, Holmes R (2025) The biter bit; scavenging behaviour of native freshwater crayfish on the carrion of native and introduced fish predators in</w:t>
+        <w:t xml:space="preserve">MacNeil C, Lee F, Kusabs IAK, Holmes R (2025) The biter bit; scavenging behaviour of native freshwater crayfish on the carrion of native and introduced fish predators in</w:t>
       </w:r>
       <w:r>
         <w:t xml:space="preserve"> </w:t>
@@ -5038,7 +5029,7 @@
         <w:pStyle w:val="Bibliography"/>
       </w:pPr>
       <w:r>
-        <w:t xml:space="preserve">Martin M, Boubée J, Kusabs I (2007)</w:t>
+        <w:t xml:space="preserve">Martin M, Boubée J, Kusabs IAK (2007)</w:t>
       </w:r>
       <w:r>
         <w:t xml:space="preserve"> </w:t>
@@ -5524,28 +5515,7 @@
       </w:hyperlink>
     </w:p>
     <w:bookmarkEnd w:id="164"/>
-    <w:bookmarkStart w:id="166" w:name="ref-Sniegula2025"/>
-    <w:p>
-      <w:pPr>
-        <w:pStyle w:val="Bibliography"/>
-      </w:pPr>
-      <w:r>
-        <w:t xml:space="preserve">Sniegula S, Konczarek D, Bonk M, et al (2025) Non-consumptive effects of native, alien and invasive alien crayfish on damselfly egg life history and carry-over effects on larval physiology. NeoBiota 97:215–235.</w:t>
-      </w:r>
-      <w:r>
-        <w:t xml:space="preserve"> </w:t>
-      </w:r>
-      <w:hyperlink r:id="rId165">
-        <w:r>
-          <w:rPr>
-            <w:rStyle w:val="Hyperlink"/>
-          </w:rPr>
-          <w:t xml:space="preserve">https://doi.org/10.3897/neobiota.97.139760</w:t>
-        </w:r>
-      </w:hyperlink>
-    </w:p>
-    <w:bookmarkEnd w:id="166"/>
-    <w:bookmarkStart w:id="168" w:name="ref-Stebbing2010"/>
+    <w:bookmarkStart w:id="166" w:name="ref-Stebbing2010"/>
     <w:p>
       <w:pPr>
         <w:pStyle w:val="Bibliography"/>
@@ -5578,23 +5548,44 @@
       <w:r>
         <w:t xml:space="preserve"> </w:t>
       </w:r>
+      <w:hyperlink r:id="rId165">
+        <w:r>
+          <w:rPr>
+            <w:rStyle w:val="Hyperlink"/>
+          </w:rPr>
+          <w:t xml:space="preserve">https://doi.org/10.1080/10236244.2010.487301</w:t>
+        </w:r>
+      </w:hyperlink>
+    </w:p>
+    <w:bookmarkEnd w:id="166"/>
+    <w:bookmarkStart w:id="168" w:name="ref-Stein1976"/>
+    <w:p>
+      <w:pPr>
+        <w:pStyle w:val="Bibliography"/>
+      </w:pPr>
+      <w:r>
+        <w:t xml:space="preserve">Stein RA, Magnuson JJ (1976) Behavioral response of crayfish to a fish predator. Ecology 57:751–761.</w:t>
+      </w:r>
+      <w:r>
+        <w:t xml:space="preserve"> </w:t>
+      </w:r>
       <w:hyperlink r:id="rId167">
         <w:r>
           <w:rPr>
             <w:rStyle w:val="Hyperlink"/>
           </w:rPr>
-          <w:t xml:space="preserve">https://doi.org/10.1080/10236244.2010.487301</w:t>
+          <w:t xml:space="preserve">https://doi.org/10.2307/1936188</w:t>
         </w:r>
       </w:hyperlink>
     </w:p>
     <w:bookmarkEnd w:id="168"/>
-    <w:bookmarkStart w:id="170" w:name="ref-Stein1976"/>
+    <w:bookmarkStart w:id="170" w:name="ref-Usio2004"/>
     <w:p>
       <w:pPr>
         <w:pStyle w:val="Bibliography"/>
       </w:pPr>
       <w:r>
-        <w:t xml:space="preserve">Stein RA, Magnuson JJ (1976) Behavioral response of crayfish to a fish predator. Ecology 57:751–761.</w:t>
+        <w:t xml:space="preserve">Usio N, Townsend CR (2004) Roles of crayfish: Consequences of predation and bioturbation for stream invertebrates. Ecology 85:807–822.</w:t>
       </w:r>
       <w:r>
         <w:t xml:space="preserve"> </w:t>
@@ -5604,33 +5595,12 @@
           <w:rPr>
             <w:rStyle w:val="Hyperlink"/>
           </w:rPr>
-          <w:t xml:space="preserve">https://doi.org/10.2307/1936188</w:t>
+          <w:t xml:space="preserve">https://doi.org/10.1890/02-0618</w:t>
         </w:r>
       </w:hyperlink>
     </w:p>
     <w:bookmarkEnd w:id="170"/>
-    <w:bookmarkStart w:id="172" w:name="ref-Usio2004"/>
-    <w:p>
-      <w:pPr>
-        <w:pStyle w:val="Bibliography"/>
-      </w:pPr>
-      <w:r>
-        <w:t xml:space="preserve">Usio N, Townsend CR (2004) Roles of crayfish: Consequences of predation and bioturbation for stream invertebrates. Ecology 85:807–822.</w:t>
-      </w:r>
-      <w:r>
-        <w:t xml:space="preserve"> </w:t>
-      </w:r>
-      <w:hyperlink r:id="rId171">
-        <w:r>
-          <w:rPr>
-            <w:rStyle w:val="Hyperlink"/>
-          </w:rPr>
-          <w:t xml:space="preserve">https://doi.org/10.1890/02-0618</w:t>
-        </w:r>
-      </w:hyperlink>
-    </w:p>
-    <w:bookmarkEnd w:id="172"/>
-    <w:bookmarkStart w:id="174" w:name="ref-Wood2020a"/>
+    <w:bookmarkStart w:id="172" w:name="ref-Wood2020a"/>
     <w:p>
       <w:pPr>
         <w:pStyle w:val="Bibliography"/>
@@ -5651,23 +5621,44 @@
       <w:r>
         <w:t xml:space="preserve"> </w:t>
       </w:r>
+      <w:hyperlink r:id="rId171">
+        <w:r>
+          <w:rPr>
+            <w:rStyle w:val="Hyperlink"/>
+          </w:rPr>
+          <w:t xml:space="preserve">https://doi.org/10.1139/cjz-2019-0089</w:t>
+        </w:r>
+      </w:hyperlink>
+    </w:p>
+    <w:bookmarkEnd w:id="172"/>
+    <w:bookmarkStart w:id="174" w:name="ref-Wood2020b"/>
+    <w:p>
+      <w:pPr>
+        <w:pStyle w:val="Bibliography"/>
+      </w:pPr>
+      <w:r>
+        <w:t xml:space="preserve">Wood TC, Moore PA (2020a) Fine-tuned responses to chemical landscapes: Crayfish use predator odors to assess threats based on relative size ratios. Ecosphere 11:e03188.</w:t>
+      </w:r>
+      <w:r>
+        <w:t xml:space="preserve"> </w:t>
+      </w:r>
       <w:hyperlink r:id="rId173">
         <w:r>
           <w:rPr>
             <w:rStyle w:val="Hyperlink"/>
           </w:rPr>
-          <w:t xml:space="preserve">https://doi.org/10.1139/cjz-2019-0089</w:t>
+          <w:t xml:space="preserve">https://doi.org/10.1002/ecs2.3188</w:t>
         </w:r>
       </w:hyperlink>
     </w:p>
     <w:bookmarkEnd w:id="174"/>
-    <w:bookmarkStart w:id="176" w:name="ref-Wood2020b"/>
+    <w:bookmarkStart w:id="176" w:name="ref-Wright2010"/>
     <w:p>
       <w:pPr>
         <w:pStyle w:val="Bibliography"/>
       </w:pPr>
       <w:r>
-        <w:t xml:space="preserve">Wood TC, Moore PA (2020a) Fine-tuned responses to chemical landscapes: Crayfish use predator odors to assess threats based on relative size ratios. Ecosphere 11:e03188.</w:t>
+        <w:t xml:space="preserve">Wright TF, Eberhard JR, Hobson EA, et al (2010) Behavioral flexibility and species invasions: The adaptive flexibility hypothesis. Ethology Ecology &amp; Evolution 22:393–404.</w:t>
       </w:r>
       <w:r>
         <w:t xml:space="preserve"> </w:t>
@@ -5677,33 +5668,12 @@
           <w:rPr>
             <w:rStyle w:val="Hyperlink"/>
           </w:rPr>
-          <w:t xml:space="preserve">https://doi.org/10.1002/ecs2.3188</w:t>
+          <w:t xml:space="preserve">https://doi.org/10.1080/03949370.2010.505580</w:t>
         </w:r>
       </w:hyperlink>
     </w:p>
     <w:bookmarkEnd w:id="176"/>
-    <w:bookmarkStart w:id="178" w:name="ref-Wright2010"/>
-    <w:p>
-      <w:pPr>
-        <w:pStyle w:val="Bibliography"/>
-      </w:pPr>
-      <w:r>
-        <w:t xml:space="preserve">Wright TF, Eberhard JR, Hobson EA, et al (2010) Behavioral flexibility and species invasions: The adaptive flexibility hypothesis. Ethology Ecology &amp; Evolution 22:393–404.</w:t>
-      </w:r>
-      <w:r>
-        <w:t xml:space="preserve"> </w:t>
-      </w:r>
-      <w:hyperlink r:id="rId177">
-        <w:r>
-          <w:rPr>
-            <w:rStyle w:val="Hyperlink"/>
-          </w:rPr>
-          <w:t xml:space="preserve">https://doi.org/10.1080/03949370.2010.505580</w:t>
-        </w:r>
-      </w:hyperlink>
-    </w:p>
-    <w:bookmarkEnd w:id="178"/>
-    <w:bookmarkStart w:id="180" w:name="ref-Zhao2024"/>
+    <w:bookmarkStart w:id="178" w:name="ref-Zhao2024"/>
     <w:p>
       <w:pPr>
         <w:pStyle w:val="Bibliography"/>
@@ -5734,7 +5704,7 @@
       <w:r>
         <w:t xml:space="preserve"> </w:t>
       </w:r>
-      <w:hyperlink r:id="rId179">
+      <w:hyperlink r:id="rId177">
         <w:r>
           <w:rPr>
             <w:rStyle w:val="Hyperlink"/>
@@ -5743,8 +5713,8 @@
         </w:r>
       </w:hyperlink>
     </w:p>
-    <w:bookmarkEnd w:id="180"/>
-    <w:bookmarkEnd w:id="181"/>
+    <w:bookmarkEnd w:id="178"/>
+    <w:bookmarkEnd w:id="179"/>
     <w:sectPr>
       <w:footerReference r:id="rId7" w:type="default"/>
       <w:pgSz w:h="16838" w:w="11906"/>

</xml_diff>

<commit_message>
rerender after beauty changes troughout the thesis
</commit_message>
<xml_diff>
--- a/docs/index.docx
+++ b/docs/index.docx
@@ -385,7 +385,7 @@
         <w:t xml:space="preserve">(Sih et al. 2010; Carthey and Banks 2014)</w:t>
       </w:r>
       <w:r>
-        <w:t xml:space="preserve">. In addition to these consumptive effects, native prey may exhibit heightened fear responses to invasive predators, leading to the development of anti-predator behaviours such as increased refuge use and avoidance of open habitats</w:t>
+        <w:t xml:space="preserve">. In addition to these consumptive effects, native prey may exhibit heightened fear responses to invasive predators, leading to the development of antipredator behaviours such as increased refuge use and avoidance of open habitats</w:t>
       </w:r>
       <w:r>
         <w:t xml:space="preserve"> </w:t>
@@ -516,7 +516,7 @@
         <w:t xml:space="preserve"> </w:t>
       </w:r>
       <w:r>
-        <w:t xml:space="preserve">(White, 1842) is a keystone species impacted by non-native species. This crayfish species is commonly known as kōura and is a taonga (culturally treasured) species for Māori, the indigenous people of Aotearoa, with strong cultural values as a food resource</w:t>
+        <w:t xml:space="preserve">White, 1842 is a keystone species impacted by non-native species. This crayfish species is commonly known as kōura and is a taonga (culturally treasured) species for Māori, the indigenous people of Aotearoa, with strong cultural values as a food resource</w:t>
       </w:r>
       <w:r>
         <w:t xml:space="preserve"> </w:t>
@@ -561,17 +561,23 @@
         <w:t xml:space="preserve">Anguilla dieffenbachii</w:t>
       </w:r>
       <w:r>
-        <w:t xml:space="preserve">) (hereafter eel) and shortfin eel (</w:t>
+        <w:t xml:space="preserve"> </w:t>
+      </w:r>
+      <w:r>
+        <w:t xml:space="preserve">Gray, 1842) (hereafter eel) and shortfin eel (</w:t>
       </w:r>
       <w:r>
         <w:rPr>
           <w:i/>
           <w:iCs/>
         </w:rPr>
-        <w:t xml:space="preserve">A. australis</w:t>
-      </w:r>
-      <w:r>
-        <w:t xml:space="preserve">) in Aotearoa</w:t>
+        <w:t xml:space="preserve">Anguilla australis</w:t>
+      </w:r>
+      <w:r>
+        <w:t xml:space="preserve"> </w:t>
+      </w:r>
+      <w:r>
+        <w:t xml:space="preserve">Richardson, 1848) in Aotearoa</w:t>
       </w:r>
       <w:r>
         <w:t xml:space="preserve"> </w:t>
@@ -590,7 +596,10 @@
         <w:t xml:space="preserve">Salmo trutta</w:t>
       </w:r>
       <w:r>
-        <w:t xml:space="preserve">), even when sourced from streams where both predators were present</w:t>
+        <w:t xml:space="preserve"> </w:t>
+      </w:r>
+      <w:r>
+        <w:t xml:space="preserve">Linnaeus, 1758), even when sourced from streams where both predators were present</w:t>
       </w:r>
       <w:r>
         <w:t xml:space="preserve"> </w:t>
@@ -621,7 +630,10 @@
         <w:t xml:space="preserve">Ameiurus nebulosus</w:t>
       </w:r>
       <w:r>
-        <w:t xml:space="preserve">) (hereafter catfish). Catfish were introduced to Aotearoa in 1877, and the invasive species has since spread to multiple lakes and rivers in the North Island</w:t>
+        <w:t xml:space="preserve"> </w:t>
+      </w:r>
+      <w:r>
+        <w:t xml:space="preserve">(Lesueur, 1819); hereafter catfish). Catfish were introduced to Aotearoa in 1877, and the invasive species has since spread to multiple lakes and rivers in the North Island</w:t>
       </w:r>
       <w:r>
         <w:t xml:space="preserve"> </w:t>
@@ -668,7 +680,7 @@
         <w:pStyle w:val="BodyText"/>
       </w:pPr>
       <w:r>
-        <w:t xml:space="preserve">In this study, we used controlled laboratory experiments to test whether the presence of a novel and native predator induced differences in kōura NCEs, specifically refuge-seeking and feeding behaviours. Our experiments tested the following two hypotheses regarding kōura behavioural responses to predator cues: 1) Kōura would show less shelter-seeking behaviour when presented with catfish compared to eels, due to naivety towards a novel predator</w:t>
+        <w:t xml:space="preserve">In this study, we used controlled laboratory experiments to test whether the presence of a novel predator and a native predator induced differences in kōura NCEs, specifically refuge-seeking and feeding behaviours. Our experiments tested the following two hypotheses regarding kōura behavioural responses to predator cues: 1) Kōura would show less shelter-seeking behaviour when presented with catfish compared to eels, due to naivety towards a novel predator</w:t>
       </w:r>
       <w:r>
         <w:t xml:space="preserve"> </w:t>
@@ -740,30 +752,7 @@
         <w:t xml:space="preserve">(McDowall 1990; Feldmann and Pole 1994; Kaulfuss et al. 2018)</w:t>
       </w:r>
       <w:r>
-        <w:t xml:space="preserve">. In this study our focus was on the macroevolutionary implications of the native predator compared to a novel invader, regardless of the local coevolutionary history. In late September 2025, catfish and eels were sourced from Lake Rotoroa in Hamilton in the Waikato region of the North Island. Experiments were conducted at the Aquatic Research Centre of the University of Waikato. All three species were held separately in holding tanks and acclimated for a week in the laboratory conditions. These included a 10:14 light:dark cycle reflecting the seasonal day-length and dechlorinated tap water with stable temperatures (15.6 °C), pH (8.4) and dissolved oxygen concentrations (10 mg l</w:t>
-      </w:r>
-      <m:oMath>
-        <m:sSup>
-          <m:e>
-            <m:r>
-              <m:t>​</m:t>
-            </m:r>
-          </m:e>
-          <m:sup>
-            <m:r>
-              <m:rPr>
-                <m:sty m:val="p"/>
-              </m:rPr>
-              <m:t>−</m:t>
-            </m:r>
-            <m:r>
-              <m:t>1</m:t>
-            </m:r>
-          </m:sup>
-        </m:sSup>
-      </m:oMath>
-      <w:r>
-        <w:t xml:space="preserve">). These parameters reflect typical physiochemical conditions in the source lakes. Kōura and fish were fed every other day with commercial carnivore pellets (Hikari Tropical, Kyorin Food Industries Ltd., Japan; animal protein 47 %). Because kōura are a taonga (treasured) species, permission was obtained from Te Arawa Lakes Trust and Te Komiti Whakahaere. All experimental procedures were conducted under University of Waikato animal ethics committee approval (protocol number: 1232; see Ethical Approval section).</w:t>
+        <w:t xml:space="preserve">. In this study our focus was on the macroevolutionary implications of the native predator compared to a novel invader, regardless of the local coevolutionary history. In late September 2025, catfish and eels were sourced from Lake Rotoroa in Hamilton in the Waikato region of the North Island. Experiments were conducted at the Aquatic Research Centre of the University of Waikato. All three species were held separately in holding tanks and acclimated for a week in the laboratory conditions. These included a 10:14 light:dark cycle reflecting the seasonal day-length and dechlorinated tap water with stable temperatures (15.6 °C), pH (8.4) and dissolved oxygen concentrations (10 mg/L). These parameters reflect typical physiochemical conditions in the source lakes. Kōura and fish were fed every other day with commercial carnivore pellets (Hikari Tropical, Kyorin Food Industries Ltd., Japan; animal protein 47%). Because kōura are a taonga (treasured) species, permission was obtained from Te Arawa Lakes Trust and Te Komiti Whakahaere. All experimental procedures were conducted under University of Waikato animal ethics committee approval (protocol number: 1232; see Ethical Approval section).</w:t>
       </w:r>
     </w:p>
     <w:bookmarkEnd w:id="21"/>
@@ -821,7 +810,39 @@
         </w:r>
       </w:hyperlink>
       <w:r>
-        <w:t xml:space="preserve">). All tanks were filled with ~26 L dechlorinated tap water and had identical environmental regimes as previously detailed for acclimatisation tanks, with water flow provided by an air stone. Each tank housed a single kōura on one side of the barrier and either a single predator (catfish or eel) or no predator (control) on the other side. A halved terracotta pot (90 mm diameter × 90 mm depth) was positioned on the kōura side of the tank to serve as a potential refuge. To control for potential tank location or compartment side effects, the position of predator treatments within the aquaria was systematically rotated between experimental rounds. The experiment was conducted across eight rounds (each lasting 5 hours), four rounds under light conditions (~400 lux, n = 32 kōura: 11 catfish, 11 eel, 10 control) and four separate rounds with different kōura under dark conditions (~70 lux, n = 32 kōura: 11 catfish, 11 eel, 10 control). Observations were made in the dark using red lighting positioned centrally above the tanks to minimise disturbance, as many aquatic species have limited sensitivity to red wavelengths and are unlikely to perceive this part of the spectrum. Following each individual experimental run, each tank was thoroughly cleaned and refilled with dechlorinated tap water before reuse. Each individual kōura was only exposed once to a fish predator and there were no mortalities of kōura or fish during experiments. All experiments were conducted within a three-week period during October 2025.</w:t>
+        <w:t xml:space="preserve">). All tanks were filled with ~26 L dechlorinated tap water and had identical environmental regimes as previously detailed for acclimatisation tanks, with water flow provided by an air stone. Each tank housed a single kōura on one side of the barrier and either a single predator (catfish or eel) or no predator (control) on the other side. A halved terracotta pot (90 mm diameter × 90 mm depth) was positioned on the kōura side of the tank to serve as a potential refuge. To control for potential tank location or compartment side effects, the position of predator treatments within the aquaria was systematically rotated between experimental rounds. The experiment was conducted across eight rounds (each lasting 5 hours), four rounds under light conditions (~400 lux,</w:t>
+      </w:r>
+      <w:r>
+        <w:t xml:space="preserve"> </w:t>
+      </w:r>
+      <w:r>
+        <w:rPr>
+          <w:i/>
+          <w:iCs/>
+        </w:rPr>
+        <w:t xml:space="preserve">n</w:t>
+      </w:r>
+      <w:r>
+        <w:t xml:space="preserve"> </w:t>
+      </w:r>
+      <w:r>
+        <w:t xml:space="preserve">= 32 kōura: 11 catfish, 11 eel, 10 control) and four separate rounds with different kōura under dark conditions (~70 lux,</w:t>
+      </w:r>
+      <w:r>
+        <w:t xml:space="preserve"> </w:t>
+      </w:r>
+      <w:r>
+        <w:rPr>
+          <w:i/>
+          <w:iCs/>
+        </w:rPr>
+        <w:t xml:space="preserve">n</w:t>
+      </w:r>
+      <w:r>
+        <w:t xml:space="preserve"> </w:t>
+      </w:r>
+      <w:r>
+        <w:t xml:space="preserve">= 32 kōura: 11 catfish, 11 eel, 10 control). Observations were made in the dark using red lighting positioned centrally above the tanks to minimise disturbance, as many aquatic species have limited sensitivity to red wavelengths and are unlikely to perceive this part of the spectrum. Following each individual experimental run, each tank was thoroughly cleaned and refilled with dechlorinated tap water before reuse. Each individual kōura was only exposed once to a fish predator and there were no mortalities of kōura or fish during experiments. All experiments were conducted within a three-week period during October 2025.</w:t>
       </w:r>
     </w:p>
     <w:tbl>
@@ -896,7 +917,7 @@
               <w:pStyle w:val="ImageCaption"/>
             </w:pPr>
             <w:r>
-              <w:t xml:space="preserve">Figure 1: (a) Aquarium layout for kōura refuge seeking behaviour experiment. Each experimental round consisted of eight aquaria run simultaneously. Each tank contained a single kōura (K) and refuge (half terracotta plant pot) on one side of a mesh divider. On the other side was either a single catfish (C), eel (E) or a control with no fish. The mesh divider allowed visual and chemical cues while preventing direct physical contact between tank occupants. (b) Experiments were repeated in light and dark (red light), with photographs showing a catfish in the light regime (left) and an eel in the dark regime (red light) (right) separated from kōura by mesh dividers.</w:t>
+              <w:t xml:space="preserve">Figure 1: (A) Aquarium layout for kōura refuge seeking behaviour experiment. Each experimental round consisted of eight aquaria run simultaneously. Each tank contained a single kōura (K) and refuge (half terracotta plant pot) on one side of a mesh divider. On the other side was either a single catfish (C), eel (E) or a control with no fish. The mesh divider allowed visual and chemical cues while preventing direct physical contact between tank occupants. (B) Experiments were repeated in light and dark (red light), with photographs showing a catfish in the light regime (left) and an eel in the dark regime (red light) (right) separated from kōura by mesh dividers.</w:t>
             </w:r>
           </w:p>
           <w:bookmarkEnd w:id="25"/>
@@ -908,7 +929,7 @@
         <w:pStyle w:val="BodyText"/>
       </w:pPr>
       <w:r>
-        <w:t xml:space="preserve">At the beginning of each experiment, an individual kōura was placed in the middle of the tank compartment containing the refuge. Kōura location was recorded at 21-time intervals over a 5-hour period, with observations spaced at progressively longer intervals to capture immediate behavioural responses at key timepoints (predator introduction at 60 min, removal at 240 min). The 0-minute recording was the individual’s initial immediate location after its addition to the tank. Kōura location was recorded as either refuge (the animal was using the refuge, being inside it or immediately behind it and touching it) or non-refuge/ in the open (any other location in the tank where the animal was not in the refuge or touching the refuge). The control tanks had no fish added but at 60 minutes and again at 240 minutes, the water in the ‘predator’ compartment was mechanically disturbed by agitating the water with a small hand net for approximately 30 seconds. This was to simulate the disturbance time associated with adding and removing fish in the other treatments with the same size hand net. At the end of each experiment, the kōura was removed after the final 300-minute observation.</w:t>
+        <w:t xml:space="preserve">At the beginning of each experiment, an individual kōura was placed in the middle of the tank compartment containing the refuge. Kōura location was recorded at 21 time intervals over a 5-hour period, with observations spaced at progressively longer intervals to capture immediate behavioural responses at key timepoints (predator introduction at 60 min, removal at 240 min). The 0-minute recording was the individual’s initial immediate location after its addition to the tank. Kōura location was recorded as either refuge (the animal was using the refuge, being inside it or immediately behind it and touching it) or non-refuge/ in the open (any other location in the tank where the animal was not in the refuge or touching the refuge). The control tanks had no fish added but at 60 minutes and again at 240 minutes, the water in the ‘predator’ compartment was mechanically disturbed by agitating the water with a small hand net for approximately 30 seconds. This was to simulate the disturbance time associated with adding and removing fish in the other treatments with the same size hand net. At the end of each experiment, the kōura was removed after the final 300-minute observation.</w:t>
       </w:r>
     </w:p>
     <w:bookmarkEnd w:id="26"/>
@@ -926,7 +947,124 @@
         <w:pStyle w:val="FirstParagraph"/>
       </w:pPr>
       <w:r>
-        <w:t xml:space="preserve">Experiments were conducted in glass tanks (320 × 170 × 170 mm), containing 5 L dechlorinated tap water and a halved terracotta pot (90 mm diameter × 90 mm depth). Catfish and eels had been held at the same density in separate identical holding tanks for a week prior to experiment. Fish exudates were collected by placing four fish (catfish or eel) in a 10 L bucket filled with water from the holding tanks for 15 minutes to concentrate the kairomones in the water. For eel and catfish treatments, 1 L from the buckets was added to each tank already holding 5 L of tap water, and for control an additional 1 L of dechlorinated tap water was added. Next, 10 Hikari Tropical carnivore pellets were added to each tank. Experimental trials showed pellets remain intact in tap water for over 24 hours. In three rounds, a total of 46 male kōura were measured and weighed. Their mean (± SD) OCL was 27.93 mm (± 4.80), with a range of 20.48 to 40.88 mm, and the mean (± SD) wet weight of 15.83 g (± 8.99), ranging from 6.00 to 42.00 g. Each kōura was then placed individually in a tank. To investigate how starvation period influenced feeding motivation, each round kōura were starved for different periods (either 0, 3 or 4 days) prior to the feeding experiment. After 0 days starvation, 14 kōura were exposed to eel water (n = 4), catfish water (n = 6) or control water (n = 4). After 3 days starvation, 16 kōura were exposed to eel water (n = 6), catfish water (n = 5) or control water (n = 5). After 4 days starvation, 16 kōura were exposed to eel water (n = 5), catfish water (n = 5) or control water (n = 6). After 24 hours, when each experiment was terminated, the number of pellets eaten (to the nearest quarter pellet) was counted and the feeding rate (pellets eaten per gram of wet weight (WW) of kōura) calculated.</w:t>
+        <w:t xml:space="preserve">Experiments were conducted in glass tanks (320 × 170 × 170 mm), containing 5 L dechlorinated tap water and a halved terracotta pot (90 mm diameter × 90 mm depth). Catfish and eels had been held at the same density in separate identical holding tanks for a week prior to experiment. Fish exudates were collected by placing four fish (catfish or eel) in a 10 L bucket filled with water from the holding tanks for 15 minutes to concentrate the kairomones in the water. For eel and catfish treatments, 1 L from the buckets was added to each tank already holding 5 L of tap water, and for control an additional 1 L of dechlorinated tap water was added. Next, 10 Hikari Tropical carnivore pellets were added to each tank. Experimental trials showed pellets remain intact in tap water for over 24 hours. In three rounds, a total of 46 male kōura were measured and weighed. Their mean (± SD) OCL was 27.93 mm (± 4.80), with a range of 20.48 to 40.88 mm, and the mean (± SD) wet weight of 15.83 g (± 8.99), ranging from 6.00 to 42.00 g. Each kōura was then placed individually in a tank. To investigate how starvation period influenced feeding motivation, each round kōura were starved for different periods (either 0, 3 or 4 days) prior to the feeding experiment. After 0 days starvation, 14 kōura were exposed to eel water (</w:t>
+      </w:r>
+      <w:r>
+        <w:rPr>
+          <w:i/>
+          <w:iCs/>
+        </w:rPr>
+        <w:t xml:space="preserve">n</w:t>
+      </w:r>
+      <w:r>
+        <w:t xml:space="preserve"> </w:t>
+      </w:r>
+      <w:r>
+        <w:t xml:space="preserve">= 4), catfish water (</w:t>
+      </w:r>
+      <w:r>
+        <w:rPr>
+          <w:i/>
+          <w:iCs/>
+        </w:rPr>
+        <w:t xml:space="preserve">n</w:t>
+      </w:r>
+      <w:r>
+        <w:t xml:space="preserve"> </w:t>
+      </w:r>
+      <w:r>
+        <w:t xml:space="preserve">= 6) or control water (</w:t>
+      </w:r>
+      <w:r>
+        <w:rPr>
+          <w:i/>
+          <w:iCs/>
+        </w:rPr>
+        <w:t xml:space="preserve">n</w:t>
+      </w:r>
+      <w:r>
+        <w:t xml:space="preserve"> </w:t>
+      </w:r>
+      <w:r>
+        <w:t xml:space="preserve">= 4). After 3 days starvation, 16 kōura were exposed to eel water (</w:t>
+      </w:r>
+      <w:r>
+        <w:rPr>
+          <w:i/>
+          <w:iCs/>
+        </w:rPr>
+        <w:t xml:space="preserve">n</w:t>
+      </w:r>
+      <w:r>
+        <w:t xml:space="preserve"> </w:t>
+      </w:r>
+      <w:r>
+        <w:t xml:space="preserve">= 6), catfish water (</w:t>
+      </w:r>
+      <w:r>
+        <w:rPr>
+          <w:i/>
+          <w:iCs/>
+        </w:rPr>
+        <w:t xml:space="preserve">n</w:t>
+      </w:r>
+      <w:r>
+        <w:t xml:space="preserve"> </w:t>
+      </w:r>
+      <w:r>
+        <w:t xml:space="preserve">= 5) or control water (</w:t>
+      </w:r>
+      <w:r>
+        <w:rPr>
+          <w:i/>
+          <w:iCs/>
+        </w:rPr>
+        <w:t xml:space="preserve">n</w:t>
+      </w:r>
+      <w:r>
+        <w:t xml:space="preserve"> </w:t>
+      </w:r>
+      <w:r>
+        <w:t xml:space="preserve">= 5). After 4 days starvation, 16 kōura were exposed to eel water (</w:t>
+      </w:r>
+      <w:r>
+        <w:rPr>
+          <w:i/>
+          <w:iCs/>
+        </w:rPr>
+        <w:t xml:space="preserve">n</w:t>
+      </w:r>
+      <w:r>
+        <w:t xml:space="preserve"> </w:t>
+      </w:r>
+      <w:r>
+        <w:t xml:space="preserve">= 5), catfish water (</w:t>
+      </w:r>
+      <w:r>
+        <w:rPr>
+          <w:i/>
+          <w:iCs/>
+        </w:rPr>
+        <w:t xml:space="preserve">n</w:t>
+      </w:r>
+      <w:r>
+        <w:t xml:space="preserve"> </w:t>
+      </w:r>
+      <w:r>
+        <w:t xml:space="preserve">= 5) or control water (</w:t>
+      </w:r>
+      <w:r>
+        <w:rPr>
+          <w:i/>
+          <w:iCs/>
+        </w:rPr>
+        <w:t xml:space="preserve">n</w:t>
+      </w:r>
+      <w:r>
+        <w:t xml:space="preserve"> </w:t>
+      </w:r>
+      <w:r>
+        <w:t xml:space="preserve">= 6). After 24 hours, when each experiment was terminated, the number of pellets eaten (to the nearest quarter pellet) was counted and the feeding rate (pellets eaten per gram of wet weight (WW) of kōura) calculated.</w:t>
       </w:r>
     </w:p>
     <w:bookmarkEnd w:id="27"/>
@@ -2722,7 +2860,23 @@
         <w:pStyle w:val="BodyText"/>
       </w:pPr>
       <w:r>
-        <w:t xml:space="preserve">For all treatments individual kōura were highly variable in their movement around tanks and use of refuges, even in the time intervals comprising the first 60 minutes of the experiment, before fish were introduced. The coefficient of variations (CVs) for kōura refuge use in the light and the dark before fish introduction were similarly high, being 60.4 % and 58.2 % (both n = 32) respectively, confirming high baseline variation in kōura refuge use, regardless of treatment type. Despite this inherent variation in individual kōura behaviour, clear patterns in kōura refuge use were evident over the course of the experiment (</w:t>
+        <w:t xml:space="preserve">For all treatments individual kōura were highly variable in their movement around tanks and use of refuges, even in the time intervals comprising the first 60 minutes of the experiment, before fish were introduced. The coefficient of variations (CVs) for kōura refuge use in the light and the dark before fish introduction were similarly high, being 60.4% and 58.2% (both</w:t>
+      </w:r>
+      <w:r>
+        <w:t xml:space="preserve"> </w:t>
+      </w:r>
+      <w:r>
+        <w:rPr>
+          <w:i/>
+          <w:iCs/>
+        </w:rPr>
+        <w:t xml:space="preserve">n</w:t>
+      </w:r>
+      <w:r>
+        <w:t xml:space="preserve"> </w:t>
+      </w:r>
+      <w:r>
+        <w:t xml:space="preserve">= 32) respectively, confirming high baseline variation in kōura refuge use, regardless of treatment type. Despite this inherent variation in individual kōura behaviour, clear patterns in kōura refuge use were evident over the course of the experiment (</w:t>
       </w:r>
       <w:hyperlink w:anchor="fig-refuge-plot">
         <w:r>
@@ -3436,12 +3590,30 @@
         <w:t xml:space="preserve">We thank Te Arawa Lakes Trust and Te Komiti Whakahaere for the opportunity to collect and study the treasured kōura. We are grateful to Soweeta Fort-D’ath and William Anaru (Te Arawa Lakes Trust), and Tihini Grant (Ngāti Pikiao). We also thank Nick Ling and Ben Roche (University of Waikato) for assisting with catfish and eel collection.</w:t>
       </w:r>
     </w:p>
-    <w:bookmarkStart w:id="51" w:name="funding-statement"/>
+    <w:bookmarkStart w:id="51" w:name="ethical-approval"/>
     <w:p>
       <w:pPr>
         <w:pStyle w:val="Heading3"/>
       </w:pPr>
       <w:r>
+        <w:t xml:space="preserve">Ethical approval</w:t>
+      </w:r>
+    </w:p>
+    <w:p>
+      <w:pPr>
+        <w:pStyle w:val="FirstParagraph"/>
+      </w:pPr>
+      <w:r>
+        <w:t xml:space="preserve">This study received ethical approval by University of Waikato animal ethics committee, protocol number: 1232. Additional permission to conduct experiments with kōura was granted by Te Arawa Lakes Trust and Te Komiti Whakahaere.</w:t>
+      </w:r>
+    </w:p>
+    <w:bookmarkEnd w:id="51"/>
+    <w:bookmarkStart w:id="52" w:name="funding-statement"/>
+    <w:p>
+      <w:pPr>
+        <w:pStyle w:val="Heading3"/>
+      </w:pPr>
+      <w:r>
         <w:t xml:space="preserve">Funding statement</w:t>
       </w:r>
     </w:p>
@@ -3453,8 +3625,8 @@
         <w:t xml:space="preserve">This research was supported by the Fish Futures programme funded through a Ministry of Business, Innovation and Employment grant (CAWX2101) with additional funding provided by the Bay of Plenty Regional Council under the Toihuarewa Waimāori - Bay of Plenty Regional Council Chair in Lake and Freshwater Science programme.</w:t>
       </w:r>
     </w:p>
-    <w:bookmarkEnd w:id="51"/>
-    <w:bookmarkStart w:id="52" w:name="authors-contributions"/>
+    <w:bookmarkEnd w:id="52"/>
+    <w:bookmarkStart w:id="53" w:name="authors-contributions"/>
     <w:p>
       <w:pPr>
         <w:pStyle w:val="Heading3"/>
@@ -3469,24 +3641,6 @@
       </w:pPr>
       <w:r>
         <w:t xml:space="preserve">Study conception and design were undertaken by O.V.R., C.M., and R.H. Experiments were executed by O.V.R. and C.M. Data analysis was performed by O.V.R. and F.L. I.A.K.K. initiated the concept of this study for inclusion in the FishFutures programme, obtained iwi consent, and provided local ecological knowledge and kōura specimens. Manuscript drafting was led by O.V.R. All authors contributed to manuscript revision, approved the results, and agreed on the final manuscript.</w:t>
-      </w:r>
-    </w:p>
-    <w:bookmarkEnd w:id="52"/>
-    <w:bookmarkStart w:id="53" w:name="ethical-approval"/>
-    <w:p>
-      <w:pPr>
-        <w:pStyle w:val="Heading3"/>
-      </w:pPr>
-      <w:r>
-        <w:t xml:space="preserve">Ethical approval</w:t>
-      </w:r>
-    </w:p>
-    <w:p>
-      <w:pPr>
-        <w:pStyle w:val="FirstParagraph"/>
-      </w:pPr>
-      <w:r>
-        <w:t xml:space="preserve">This study received ethical approval by University of Waikato animal ethics committee, protocol number: 1232. Additional permission to conduct experiments with kōura was granted by Te Arawa Lakes Trust and Te Komiti Whakahaere.</w:t>
       </w:r>
     </w:p>
     <w:bookmarkEnd w:id="53"/>

</xml_diff>

<commit_message>
update for final thesis submission
</commit_message>
<xml_diff>
--- a/docs/index.docx
+++ b/docs/index.docx
@@ -349,7 +349,7 @@
         <w:t xml:space="preserve">Ameiurus nebulosus</w:t>
       </w:r>
       <w:r>
-        <w:t xml:space="preserve">). Under laboratory conditions, we tested whether visual and chemical cues from these two predators induced different refuge-seeking and feeding behaviour responses by kōura. In dark conditions, kōura exposed to catfish showed significantly greater refuge-seeking behaviour than those exposed to eels. This result is consistent with the generalisation theory triggered by unfamiliar predator cues rather than classic prey naivety. Our study indicates catfish incursions may provoke a greater NCE on kōura behaviours than resident eels. As catfish range expansion continues, these NCEs may represent an ecologically significant and underappreciated threat to kōura populations, compounding the direct predation pressure already documented for this invader.</w:t>
+        <w:t xml:space="preserve">). Under laboratory conditions, we tested whether visual and chemical cues from these two predators induced different refuge-seeking and feeding behaviour responses by kōura. In dark conditions, kōura exposed to catfish showed significantly greater refuge-seeking behaviour than those exposed to eels. This result is consistent with the generalisation theory triggered by unfamiliar predator cues rather than classic prey naivety. Our study indicates catfish incursions may provoke a greater NCE on kōura behaviours than native eels. As catfish range expansion continues, these NCEs may represent an ecologically significant and underappreciated threat to kōura populations, compounding the direct predation pressure already documented for this invader.</w:t>
       </w:r>
     </w:p>
     <w:bookmarkEnd w:id="19"/>
@@ -711,13 +711,13 @@
       </w:r>
     </w:p>
     <w:bookmarkEnd w:id="20"/>
-    <w:bookmarkStart w:id="29" w:name="materials-and-methods"/>
+    <w:bookmarkStart w:id="29" w:name="methods"/>
     <w:p>
       <w:pPr>
         <w:pStyle w:val="Heading2"/>
       </w:pPr>
       <w:r>
-        <w:t xml:space="preserve">Materials and Methods</w:t>
+        <w:t xml:space="preserve">Methods</w:t>
       </w:r>
     </w:p>
     <w:bookmarkStart w:id="21" w:name="animal-collection-and-preparation"/>

</xml_diff>